<commit_message>
Add gym name and address to Google Places data collection
- Extracted and stored gym names and formatted addresses from Google Places API response.
- Implemented data quality checks for missing gym names and addresses in the main dataset.
</commit_message>
<xml_diff>
--- a/HW Week 1 and 2/Florida_Fitness_Market_Predictions_and_Insights.docx
+++ b/HW Week 1 and 2/Florida_Fitness_Market_Predictions_and_Insights.docx
@@ -290,7 +290,7 @@
         <w:pStyle w:val="ListBullet"/>
       </w:pPr>
       <w:r>
-        <w:t>Observed location data: live Google Places Text Search results, exact-county filtered and deduplicated by Place ID.</w:t>
+        <w:t>Observed location data: 387 Google Places records with gym names, formatted street addresses, coordinates, ratings, and review counts; exact-county filtered and deduplicated by Place ID.</w:t>
       </w:r>
     </w:p>
     <w:p>
@@ -6071,14 +6071,6 @@
         <w:pStyle w:val="ListBullet"/>
       </w:pPr>
       <w:r>
-        <w:t>build_reports.py: deterministic Word report generation from the analytical outputs.</w:t>
-      </w:r>
-    </w:p>
-    <w:p>
-      <w:pPr>
-        <w:pStyle w:val="ListBullet"/>
-      </w:pPr>
-      <w:r>
         <w:t>data/MainDataset.csv: 67 rows and 8 required columns.</w:t>
       </w:r>
     </w:p>

</xml_diff>